<commit_message>
Update latest Introduction and Related Work drafts
</commit_message>
<xml_diff>
--- a/分章节初稿/Introduction_中文修订稿_v4_表达与参考文献规范版.docx
+++ b/分章节初稿/Introduction_中文修订稿_v4_表达与参考文献规范版.docx
@@ -17,7 +17,7 @@
       <w:pPr>
         <w:keepLines w:val="0"/>
         <w:widowControl/>
-        <w:spacing w:line="360" w:lineRule="auto" w:before="0" w:after="0"/>
+        <w:spacing w:before="0" w:after="0" w:line="360" w:lineRule="auto"/>
         <w:ind w:firstLine="420"/>
         <w:jc w:val="both"/>
       </w:pPr>
@@ -29,7 +29,7 @@
       <w:pPr>
         <w:keepLines w:val="0"/>
         <w:widowControl/>
-        <w:spacing w:line="360" w:lineRule="auto" w:before="0" w:after="0"/>
+        <w:spacing w:before="0" w:after="0" w:line="360" w:lineRule="auto"/>
         <w:ind w:firstLine="420"/>
         <w:jc w:val="both"/>
         <w:rPr>
@@ -39,15 +39,20 @@
         </w:rPr>
       </w:pPr>
       <w:r>
-        <w:t>在这一背景下，深度神经网络（Deep Neural Network, DNN）推理服务正由云端向边缘侧延伸，形成面向实时感知与决策的边缘智能服务。例如，自动驾驶车辆需要及时完成目标、车道线和交通标志识别；增强现实系统需要持续分析用户动作和周围场景；移动机器人则需要依据视觉推理结果更新控制决策。这些应用通常具有明确的响应时限。一旦推理结果返回过晚，即使结果准确，也可能失去实际价值 [2]–[4]。因此，边缘智能系统不仅需要完成推理，还需要在有限资源条件下持续满足请求级时效要求。</w:t>
+        <w:t>在这一背景下，深度神经网络（Deep Neural Network, DNN）推理服务正由云端向边缘侧延伸，形成面向实时感知与决策的边缘智能服务。例如，自动驾驶车辆需要及时完成目标、车道线和交通标志识别；增强现实系统需要持续分析用户动作和周围场景；移动机器人则需要依据视觉推理结果更新控制决策。这些应用通常具有明确的响应时</w:t>
+      </w:r>
+      <w:bookmarkStart w:id="0" w:name="_GoBack"/>
+      <w:bookmarkEnd w:id="0"/>
+      <w:r>
+        <w:t>限。一旦推理结果返回过晚，即使结果准确，也可能失去实际价值 [2]–[4]。因此，边缘智能系统不仅需要完成推理，还需要在有限资源条件下持续满足请求级时效要求。</w:t>
       </w:r>
     </w:p>
     <w:p>
       <w:pPr>
         <w:keepLines w:val="0"/>
         <w:widowControl/>
-        <w:spacing w:line="360" w:lineRule="auto" w:before="0" w:after="0"/>
-        <w:ind w:firstLineChars="200" w:firstLine="420"/>
+        <w:spacing w:before="0" w:after="0" w:line="360" w:lineRule="auto"/>
+        <w:ind w:firstLine="420" w:firstLineChars="200"/>
         <w:jc w:val="both"/>
       </w:pPr>
       <w:r>
@@ -58,7 +63,7 @@
       <w:pPr>
         <w:keepLines w:val="0"/>
         <w:widowControl/>
-        <w:spacing w:line="360" w:lineRule="auto" w:before="0" w:after="0"/>
+        <w:spacing w:before="0" w:after="0" w:line="360" w:lineRule="auto"/>
         <w:ind w:firstLine="420"/>
         <w:jc w:val="both"/>
       </w:pPr>
@@ -70,7 +75,7 @@
       <w:pPr>
         <w:keepLines w:val="0"/>
         <w:widowControl/>
-        <w:spacing w:line="360" w:lineRule="auto" w:before="0" w:after="0"/>
+        <w:spacing w:before="0" w:after="0" w:line="360" w:lineRule="auto"/>
         <w:ind w:firstLine="420"/>
         <w:jc w:val="both"/>
         <w:rPr>
@@ -87,7 +92,7 @@
       <w:pPr>
         <w:keepLines w:val="0"/>
         <w:widowControl/>
-        <w:spacing w:line="360" w:lineRule="auto" w:before="0" w:after="0"/>
+        <w:spacing w:before="0" w:after="0" w:line="360" w:lineRule="auto"/>
         <w:ind w:firstLine="420"/>
         <w:jc w:val="both"/>
         <w:rPr>
@@ -104,7 +109,7 @@
       <w:pPr>
         <w:keepLines w:val="0"/>
         <w:widowControl/>
-        <w:spacing w:line="360" w:lineRule="auto" w:before="0" w:after="0"/>
+        <w:spacing w:before="0" w:after="0" w:line="360" w:lineRule="auto"/>
         <w:ind w:firstLine="420"/>
         <w:jc w:val="both"/>
         <w:rPr>
@@ -126,8 +131,8 @@
         <w:keepLines w:val="0"/>
         <w:widowControl/>
         <w:suppressLineNumbers w:val="0"/>
-        <w:spacing w:line="360" w:lineRule="auto" w:before="0" w:after="0"/>
-        <w:ind w:firstLineChars="200" w:firstLine="420"/>
+        <w:spacing w:before="0" w:after="0" w:line="360" w:lineRule="auto"/>
+        <w:ind w:firstLine="420" w:firstLineChars="200"/>
         <w:jc w:val="both"/>
         <w:rPr>
           <w:rFonts w:ascii="Calibri" w:hAnsi="Calibri" w:eastAsia="宋体" w:cs="Calibri"/>
@@ -148,7 +153,7 @@
         <w:keepLines w:val="0"/>
         <w:widowControl/>
         <w:suppressLineNumbers w:val="0"/>
-        <w:spacing w:line="360" w:lineRule="auto" w:before="0" w:after="0"/>
+        <w:spacing w:before="0" w:after="0" w:line="360" w:lineRule="auto"/>
         <w:ind w:firstLine="420"/>
         <w:jc w:val="both"/>
         <w:rPr>
@@ -170,7 +175,7 @@
         <w:keepLines w:val="0"/>
         <w:widowControl/>
         <w:suppressLineNumbers w:val="0"/>
-        <w:spacing w:line="360" w:lineRule="auto" w:before="0" w:after="0"/>
+        <w:spacing w:before="0" w:after="0" w:line="360" w:lineRule="auto"/>
         <w:ind w:firstLine="420"/>
         <w:jc w:val="both"/>
       </w:pPr>
@@ -254,7 +259,7 @@
     <w:p>
       <w:pPr>
         <w:keepLines/>
-        <w:spacing w:line="276" w:lineRule="auto" w:before="0" w:after="40"/>
+        <w:spacing w:before="0" w:after="40" w:line="276" w:lineRule="auto"/>
         <w:ind w:left="420" w:hanging="420"/>
         <w:jc w:val="left"/>
       </w:pPr>
@@ -269,7 +274,7 @@
     <w:p>
       <w:pPr>
         <w:keepLines/>
-        <w:spacing w:line="276" w:lineRule="auto" w:before="0" w:after="40"/>
+        <w:spacing w:before="0" w:after="40" w:line="276" w:lineRule="auto"/>
         <w:ind w:left="420" w:hanging="420"/>
         <w:jc w:val="left"/>
       </w:pPr>
@@ -284,7 +289,7 @@
     <w:p>
       <w:pPr>
         <w:keepLines/>
-        <w:spacing w:line="276" w:lineRule="auto" w:before="0" w:after="40"/>
+        <w:spacing w:before="0" w:after="40" w:line="276" w:lineRule="auto"/>
         <w:ind w:left="420" w:hanging="420"/>
         <w:jc w:val="left"/>
       </w:pPr>
@@ -299,7 +304,7 @@
     <w:p>
       <w:pPr>
         <w:keepLines/>
-        <w:spacing w:line="276" w:lineRule="auto" w:before="0" w:after="40"/>
+        <w:spacing w:before="0" w:after="40" w:line="276" w:lineRule="auto"/>
         <w:ind w:left="420" w:hanging="420"/>
         <w:jc w:val="left"/>
       </w:pPr>
@@ -314,7 +319,7 @@
     <w:p>
       <w:pPr>
         <w:keepLines/>
-        <w:spacing w:line="276" w:lineRule="auto" w:before="0" w:after="40"/>
+        <w:spacing w:before="0" w:after="40" w:line="276" w:lineRule="auto"/>
         <w:ind w:left="420" w:hanging="420"/>
         <w:jc w:val="left"/>
       </w:pPr>
@@ -329,7 +334,7 @@
     <w:p>
       <w:pPr>
         <w:keepLines/>
-        <w:spacing w:line="276" w:lineRule="auto" w:before="0" w:after="40"/>
+        <w:spacing w:before="0" w:after="40" w:line="276" w:lineRule="auto"/>
         <w:ind w:left="420" w:hanging="420"/>
         <w:jc w:val="left"/>
       </w:pPr>
@@ -344,7 +349,7 @@
     <w:p>
       <w:pPr>
         <w:keepLines/>
-        <w:spacing w:line="276" w:lineRule="auto" w:before="0" w:after="40"/>
+        <w:spacing w:before="0" w:after="40" w:line="276" w:lineRule="auto"/>
         <w:ind w:left="420" w:hanging="420"/>
         <w:jc w:val="left"/>
       </w:pPr>
@@ -359,7 +364,7 @@
     <w:p>
       <w:pPr>
         <w:keepLines/>
-        <w:spacing w:line="276" w:lineRule="auto" w:before="0" w:after="40"/>
+        <w:spacing w:before="0" w:after="40" w:line="276" w:lineRule="auto"/>
         <w:ind w:left="420" w:hanging="420"/>
         <w:jc w:val="left"/>
       </w:pPr>
@@ -374,7 +379,7 @@
     <w:p>
       <w:pPr>
         <w:keepLines/>
-        <w:spacing w:line="276" w:lineRule="auto" w:before="0" w:after="40"/>
+        <w:spacing w:before="0" w:after="40" w:line="276" w:lineRule="auto"/>
         <w:ind w:left="420" w:hanging="420"/>
         <w:jc w:val="left"/>
       </w:pPr>
@@ -389,7 +394,7 @@
     <w:p>
       <w:pPr>
         <w:keepLines/>
-        <w:spacing w:line="276" w:lineRule="auto" w:before="0" w:after="40"/>
+        <w:spacing w:before="0" w:after="40" w:line="276" w:lineRule="auto"/>
         <w:ind w:left="420" w:hanging="420"/>
         <w:jc w:val="left"/>
       </w:pPr>
@@ -404,7 +409,7 @@
     <w:p>
       <w:pPr>
         <w:keepLines/>
-        <w:spacing w:line="276" w:lineRule="auto" w:before="0" w:after="40"/>
+        <w:spacing w:before="0" w:after="40" w:line="276" w:lineRule="auto"/>
         <w:ind w:left="420" w:hanging="420"/>
         <w:jc w:val="left"/>
       </w:pPr>
@@ -509,7 +514,7 @@
   <w:footnote w:type="separator" w:id="0">
     <w:p>
       <w:pPr>
-        <w:spacing w:before="0" w:after="0" w:line="320" w:lineRule="auto"/>
+        <w:spacing w:before="0" w:after="0" w:line="360" w:lineRule="auto"/>
       </w:pPr>
       <w:r>
         <w:separator/>
@@ -519,7 +524,7 @@
   <w:footnote w:type="continuationSeparator" w:id="1">
     <w:p>
       <w:pPr>
-        <w:spacing w:before="0" w:after="0" w:line="320" w:lineRule="auto"/>
+        <w:spacing w:before="0" w:after="0" w:line="360" w:lineRule="auto"/>
       </w:pPr>
       <w:r>
         <w:continuationSeparator/>
@@ -546,23 +551,6 @@
 <file path=word/numbering.xml><?xml version="1.0" encoding="utf-8"?>
 <w:numbering xmlns:wpc="http://schemas.microsoft.com/office/word/2010/wordprocessingCanvas" xmlns:mc="http://schemas.openxmlformats.org/markup-compatibility/2006" xmlns:o="urn:schemas-microsoft-com:office:office" xmlns:r="http://schemas.openxmlformats.org/officeDocument/2006/relationships" xmlns:m="http://schemas.openxmlformats.org/officeDocument/2006/math" xmlns:v="urn:schemas-microsoft-com:vml" xmlns:wp14="http://schemas.microsoft.com/office/word/2010/wordprocessingDrawing" xmlns:wp="http://schemas.openxmlformats.org/drawingml/2006/wordprocessingDrawing" xmlns:w10="urn:schemas-microsoft-com:office:word" xmlns:w="http://schemas.openxmlformats.org/wordprocessingml/2006/main" xmlns:w14="http://schemas.microsoft.com/office/word/2010/wordml" xmlns:wpg="http://schemas.microsoft.com/office/word/2010/wordprocessingGroup" xmlns:wpi="http://schemas.microsoft.com/office/word/2010/wordprocessingInk" xmlns:wne="http://schemas.microsoft.com/office/word/2006/wordml" xmlns:wps="http://schemas.microsoft.com/office/word/2010/wordprocessingShape" xmlns:wpsCustomData="http://www.wps.cn/officeDocument/2013/wpsCustomData" mc:Ignorable="w14 wp14">
   <w:abstractNum w:abstractNumId="0">
-    <w:nsid w:val="CF092B84"/>
-    <w:multiLevelType w:val="singleLevel"/>
-    <w:tmpl w:val="CF092B84"/>
-    <w:lvl w:ilvl="0" w:tentative="0">
-      <w:start w:val="1"/>
-      <w:numFmt w:val="decimal"/>
-      <w:lvlText w:val="%1."/>
-      <w:lvlJc w:val="left"/>
-      <w:pPr>
-        <w:tabs>
-          <w:tab w:val="left" w:pos="540"/>
-        </w:tabs>
-        <w:ind w:left="540" w:hanging="280"/>
-      </w:pPr>
-    </w:lvl>
-  </w:abstractNum>
-  <w:abstractNum w:abstractNumId="1">
     <w:nsid w:val="FFFFFF7E"/>
     <w:multiLevelType w:val="singleLevel"/>
     <w:tmpl w:val="FFFFFF7E"/>
@@ -580,7 +568,7 @@
       </w:pPr>
     </w:lvl>
   </w:abstractNum>
-  <w:abstractNum w:abstractNumId="2">
+  <w:abstractNum w:abstractNumId="1">
     <w:nsid w:val="FFFFFF7F"/>
     <w:multiLevelType w:val="singleLevel"/>
     <w:tmpl w:val="FFFFFF7F"/>
@@ -598,7 +586,7 @@
       </w:pPr>
     </w:lvl>
   </w:abstractNum>
-  <w:abstractNum w:abstractNumId="3">
+  <w:abstractNum w:abstractNumId="2">
     <w:nsid w:val="FFFFFF82"/>
     <w:multiLevelType w:val="singleLevel"/>
     <w:tmpl w:val="FFFFFF82"/>
@@ -619,7 +607,7 @@
       </w:rPr>
     </w:lvl>
   </w:abstractNum>
-  <w:abstractNum w:abstractNumId="4">
+  <w:abstractNum w:abstractNumId="3">
     <w:nsid w:val="FFFFFF83"/>
     <w:multiLevelType w:val="singleLevel"/>
     <w:tmpl w:val="FFFFFF83"/>
@@ -640,7 +628,7 @@
       </w:rPr>
     </w:lvl>
   </w:abstractNum>
-  <w:abstractNum w:abstractNumId="5">
+  <w:abstractNum w:abstractNumId="4">
     <w:nsid w:val="FFFFFF88"/>
     <w:multiLevelType w:val="singleLevel"/>
     <w:tmpl w:val="FFFFFF88"/>
@@ -658,7 +646,7 @@
       </w:pPr>
     </w:lvl>
   </w:abstractNum>
-  <w:abstractNum w:abstractNumId="6">
+  <w:abstractNum w:abstractNumId="5">
     <w:nsid w:val="FFFFFF89"/>
     <w:multiLevelType w:val="singleLevel"/>
     <w:tmpl w:val="FFFFFF89"/>
@@ -680,25 +668,22 @@
     </w:lvl>
   </w:abstractNum>
   <w:num w:numId="1">
+    <w:abstractNumId w:val="1"/>
+  </w:num>
+  <w:num w:numId="2">
+    <w:abstractNumId w:val="4"/>
+  </w:num>
+  <w:num w:numId="3">
+    <w:abstractNumId w:val="5"/>
+  </w:num>
+  <w:num w:numId="4">
     <w:abstractNumId w:val="2"/>
   </w:num>
-  <w:num w:numId="2">
-    <w:abstractNumId w:val="5"/>
-  </w:num>
-  <w:num w:numId="3">
-    <w:abstractNumId w:val="6"/>
-  </w:num>
-  <w:num w:numId="4">
-    <w:abstractNumId w:val="3"/>
-  </w:num>
   <w:num w:numId="5">
-    <w:abstractNumId w:val="1"/>
+    <w:abstractNumId w:val="0"/>
   </w:num>
   <w:num w:numId="6">
-    <w:abstractNumId w:val="4"/>
-  </w:num>
-  <w:num w:numId="7">
-    <w:abstractNumId w:val="0"/>
+    <w:abstractNumId w:val="3"/>
   </w:num>
 </w:numbering>
 </file>
@@ -745,8 +730,8 @@
     <w:lsdException w:uiPriority="99" w:name="Normal Indent"/>
     <w:lsdException w:uiPriority="99" w:name="footnote text"/>
     <w:lsdException w:uiPriority="99" w:name="annotation text"/>
-    <w:lsdException w:uiPriority="99" w:semiHidden="0" w:name="header"/>
-    <w:lsdException w:uiPriority="99" w:semiHidden="0" w:name="footer"/>
+    <w:lsdException w:qFormat="1" w:uiPriority="99" w:semiHidden="0" w:name="header"/>
+    <w:lsdException w:qFormat="1" w:uiPriority="99" w:semiHidden="0" w:name="footer"/>
     <w:lsdException w:uiPriority="99" w:name="index heading"/>
     <w:lsdException w:qFormat="1" w:uiPriority="35" w:name="caption"/>
     <w:lsdException w:uiPriority="99" w:name="table of figures"/>
@@ -761,7 +746,7 @@
     <w:lsdException w:uiPriority="99" w:name="table of authorities"/>
     <w:lsdException w:uiPriority="99" w:semiHidden="0" w:name="macro"/>
     <w:lsdException w:uiPriority="99" w:name="toa heading"/>
-    <w:lsdException w:uiPriority="99" w:semiHidden="0" w:name="List"/>
+    <w:lsdException w:qFormat="1" w:uiPriority="99" w:semiHidden="0" w:name="List"/>
     <w:lsdException w:qFormat="1" w:uiPriority="99" w:semiHidden="0" w:name="List Bullet"/>
     <w:lsdException w:uiPriority="99" w:semiHidden="0" w:name="List Number"/>
     <w:lsdException w:qFormat="1" w:uiPriority="99" w:semiHidden="0" w:name="List 2"/>
@@ -779,8 +764,8 @@
     <w:lsdException w:qFormat="1" w:unhideWhenUsed="0" w:uiPriority="10" w:semiHidden="0" w:name="Title"/>
     <w:lsdException w:uiPriority="99" w:name="Closing"/>
     <w:lsdException w:uiPriority="99" w:name="Signature"/>
-    <w:lsdException w:uiPriority="1" w:name="Default Paragraph Font"/>
-    <w:lsdException w:uiPriority="99" w:semiHidden="0" w:name="Body Text"/>
+    <w:lsdException w:qFormat="1" w:uiPriority="1" w:name="Default Paragraph Font"/>
+    <w:lsdException w:qFormat="1" w:uiPriority="99" w:semiHidden="0" w:name="Body Text"/>
     <w:lsdException w:uiPriority="99" w:name="Body Text Indent"/>
     <w:lsdException w:qFormat="1" w:uiPriority="99" w:semiHidden="0" w:name="List Continue"/>
     <w:lsdException w:qFormat="1" w:uiPriority="99" w:semiHidden="0" w:name="List Continue 2"/>
@@ -795,7 +780,7 @@
     <w:lsdException w:uiPriority="99" w:name="Body Text First Indent 2"/>
     <w:lsdException w:uiPriority="99" w:name="Note Heading"/>
     <w:lsdException w:uiPriority="99" w:semiHidden="0" w:name="Body Text 2"/>
-    <w:lsdException w:uiPriority="99" w:semiHidden="0" w:name="Body Text 3"/>
+    <w:lsdException w:qFormat="1" w:uiPriority="99" w:semiHidden="0" w:name="Body Text 3"/>
     <w:lsdException w:uiPriority="99" w:name="Body Text Indent 2"/>
     <w:lsdException w:uiPriority="99" w:name="Body Text Indent 3"/>
     <w:lsdException w:uiPriority="99" w:name="Block Text"/>
@@ -806,11 +791,11 @@
     <w:lsdException w:uiPriority="99" w:name="Document Map"/>
     <w:lsdException w:uiPriority="99" w:name="Plain Text"/>
     <w:lsdException w:uiPriority="99" w:name="E-mail Signature"/>
-    <w:lsdException w:uiPriority="99" w:name="Normal (Web)"/>
+    <w:lsdException w:qFormat="1" w:uiPriority="99" w:name="Normal (Web)"/>
     <w:lsdException w:uiPriority="99" w:name="HTML Acronym"/>
     <w:lsdException w:uiPriority="99" w:name="HTML Address"/>
     <w:lsdException w:uiPriority="99" w:name="HTML Cite"/>
-    <w:lsdException w:uiPriority="99" w:name="HTML Code"/>
+    <w:lsdException w:qFormat="1" w:uiPriority="99" w:name="HTML Code"/>
     <w:lsdException w:uiPriority="99" w:name="HTML Definition"/>
     <w:lsdException w:uiPriority="99" w:name="HTML Keyboard"/>
     <w:lsdException w:uiPriority="99" w:name="HTML Preformatted"/>
@@ -862,107 +847,107 @@
     <w:lsdException w:uiPriority="99" w:name="Table Web 2"/>
     <w:lsdException w:uiPriority="99" w:name="Table Web 3"/>
     <w:lsdException w:uiPriority="99" w:name="Balloon Text"/>
-    <w:lsdException w:unhideWhenUsed="0" w:uiPriority="59" w:semiHidden="0" w:name="Table Grid"/>
+    <w:lsdException w:qFormat="1" w:unhideWhenUsed="0" w:uiPriority="59" w:semiHidden="0" w:name="Table Grid"/>
     <w:lsdException w:uiPriority="99" w:name="Table Theme"/>
     <w:lsdException w:qFormat="1" w:unhideWhenUsed="0" w:uiPriority="1" w:semiHidden="0" w:name="No Spacing"/>
     <w:lsdException w:unhideWhenUsed="0" w:uiPriority="60" w:semiHidden="0" w:name="Light Shading"/>
-    <w:lsdException w:unhideWhenUsed="0" w:uiPriority="61" w:semiHidden="0" w:name="Light List"/>
+    <w:lsdException w:qFormat="1" w:unhideWhenUsed="0" w:uiPriority="61" w:semiHidden="0" w:name="Light List"/>
     <w:lsdException w:qFormat="1" w:unhideWhenUsed="0" w:uiPriority="62" w:semiHidden="0" w:name="Light Grid"/>
     <w:lsdException w:unhideWhenUsed="0" w:uiPriority="63" w:semiHidden="0" w:name="Medium Shading 1"/>
     <w:lsdException w:qFormat="1" w:unhideWhenUsed="0" w:uiPriority="64" w:semiHidden="0" w:name="Medium Shading 2"/>
     <w:lsdException w:qFormat="1" w:unhideWhenUsed="0" w:uiPriority="65" w:semiHidden="0" w:name="Medium List 1"/>
-    <w:lsdException w:unhideWhenUsed="0" w:uiPriority="66" w:semiHidden="0" w:name="Medium List 2"/>
-    <w:lsdException w:unhideWhenUsed="0" w:uiPriority="67" w:semiHidden="0" w:name="Medium Grid 1"/>
+    <w:lsdException w:qFormat="1" w:unhideWhenUsed="0" w:uiPriority="66" w:semiHidden="0" w:name="Medium List 2"/>
+    <w:lsdException w:qFormat="1" w:unhideWhenUsed="0" w:uiPriority="67" w:semiHidden="0" w:name="Medium Grid 1"/>
     <w:lsdException w:qFormat="1" w:unhideWhenUsed="0" w:uiPriority="68" w:semiHidden="0" w:name="Medium Grid 2"/>
-    <w:lsdException w:unhideWhenUsed="0" w:uiPriority="69" w:semiHidden="0" w:name="Medium Grid 3"/>
-    <w:lsdException w:unhideWhenUsed="0" w:uiPriority="70" w:semiHidden="0" w:name="Dark List"/>
-    <w:lsdException w:unhideWhenUsed="0" w:uiPriority="71" w:semiHidden="0" w:name="Colorful Shading"/>
-    <w:lsdException w:unhideWhenUsed="0" w:uiPriority="72" w:semiHidden="0" w:name="Colorful List"/>
+    <w:lsdException w:qFormat="1" w:unhideWhenUsed="0" w:uiPriority="69" w:semiHidden="0" w:name="Medium Grid 3"/>
+    <w:lsdException w:qFormat="1" w:unhideWhenUsed="0" w:uiPriority="70" w:semiHidden="0" w:name="Dark List"/>
+    <w:lsdException w:qFormat="1" w:unhideWhenUsed="0" w:uiPriority="71" w:semiHidden="0" w:name="Colorful Shading"/>
+    <w:lsdException w:qFormat="1" w:unhideWhenUsed="0" w:uiPriority="72" w:semiHidden="0" w:name="Colorful List"/>
     <w:lsdException w:qFormat="1" w:unhideWhenUsed="0" w:uiPriority="73" w:semiHidden="0" w:name="Colorful Grid"/>
     <w:lsdException w:qFormat="1" w:unhideWhenUsed="0" w:uiPriority="60" w:semiHidden="0" w:name="Light Shading Accent 1"/>
-    <w:lsdException w:unhideWhenUsed="0" w:uiPriority="61" w:semiHidden="0" w:name="Light List Accent 1"/>
-    <w:lsdException w:unhideWhenUsed="0" w:uiPriority="62" w:semiHidden="0" w:name="Light Grid Accent 1"/>
+    <w:lsdException w:qFormat="1" w:unhideWhenUsed="0" w:uiPriority="61" w:semiHidden="0" w:name="Light List Accent 1"/>
+    <w:lsdException w:qFormat="1" w:unhideWhenUsed="0" w:uiPriority="62" w:semiHidden="0" w:name="Light Grid Accent 1"/>
     <w:lsdException w:qFormat="1" w:unhideWhenUsed="0" w:uiPriority="63" w:semiHidden="0" w:name="Medium Shading 1 Accent 1"/>
-    <w:lsdException w:unhideWhenUsed="0" w:uiPriority="64" w:semiHidden="0" w:name="Medium Shading 2 Accent 1"/>
+    <w:lsdException w:qFormat="1" w:unhideWhenUsed="0" w:uiPriority="64" w:semiHidden="0" w:name="Medium Shading 2 Accent 1"/>
     <w:lsdException w:unhideWhenUsed="0" w:uiPriority="65" w:semiHidden="0" w:name="Medium List 1 Accent 1"/>
     <w:lsdException w:qFormat="1" w:unhideWhenUsed="0" w:uiPriority="34" w:semiHidden="0" w:name="List Paragraph"/>
     <w:lsdException w:qFormat="1" w:unhideWhenUsed="0" w:uiPriority="29" w:semiHidden="0" w:name="Quote"/>
     <w:lsdException w:qFormat="1" w:unhideWhenUsed="0" w:uiPriority="30" w:semiHidden="0" w:name="Intense Quote"/>
-    <w:lsdException w:unhideWhenUsed="0" w:uiPriority="66" w:semiHidden="0" w:name="Medium List 2 Accent 1"/>
+    <w:lsdException w:qFormat="1" w:unhideWhenUsed="0" w:uiPriority="66" w:semiHidden="0" w:name="Medium List 2 Accent 1"/>
     <w:lsdException w:qFormat="1" w:unhideWhenUsed="0" w:uiPriority="67" w:semiHidden="0" w:name="Medium Grid 1 Accent 1"/>
     <w:lsdException w:qFormat="1" w:unhideWhenUsed="0" w:uiPriority="68" w:semiHidden="0" w:name="Medium Grid 2 Accent 1"/>
     <w:lsdException w:qFormat="1" w:unhideWhenUsed="0" w:uiPriority="69" w:semiHidden="0" w:name="Medium Grid 3 Accent 1"/>
-    <w:lsdException w:unhideWhenUsed="0" w:uiPriority="70" w:semiHidden="0" w:name="Dark List Accent 1"/>
+    <w:lsdException w:qFormat="1" w:unhideWhenUsed="0" w:uiPriority="70" w:semiHidden="0" w:name="Dark List Accent 1"/>
     <w:lsdException w:qFormat="1" w:unhideWhenUsed="0" w:uiPriority="71" w:semiHidden="0" w:name="Colorful Shading Accent 1"/>
     <w:lsdException w:qFormat="1" w:unhideWhenUsed="0" w:uiPriority="72" w:semiHidden="0" w:name="Colorful List Accent 1"/>
     <w:lsdException w:qFormat="1" w:unhideWhenUsed="0" w:uiPriority="73" w:semiHidden="0" w:name="Colorful Grid Accent 1"/>
-    <w:lsdException w:unhideWhenUsed="0" w:uiPriority="60" w:semiHidden="0" w:name="Light Shading Accent 2"/>
-    <w:lsdException w:unhideWhenUsed="0" w:uiPriority="61" w:semiHidden="0" w:name="Light List Accent 2"/>
+    <w:lsdException w:qFormat="1" w:unhideWhenUsed="0" w:uiPriority="60" w:semiHidden="0" w:name="Light Shading Accent 2"/>
+    <w:lsdException w:qFormat="1" w:unhideWhenUsed="0" w:uiPriority="61" w:semiHidden="0" w:name="Light List Accent 2"/>
     <w:lsdException w:unhideWhenUsed="0" w:uiPriority="62" w:semiHidden="0" w:name="Light Grid Accent 2"/>
-    <w:lsdException w:unhideWhenUsed="0" w:uiPriority="63" w:semiHidden="0" w:name="Medium Shading 1 Accent 2"/>
-    <w:lsdException w:unhideWhenUsed="0" w:uiPriority="64" w:semiHidden="0" w:name="Medium Shading 2 Accent 2"/>
+    <w:lsdException w:qFormat="1" w:unhideWhenUsed="0" w:uiPriority="63" w:semiHidden="0" w:name="Medium Shading 1 Accent 2"/>
+    <w:lsdException w:qFormat="1" w:unhideWhenUsed="0" w:uiPriority="64" w:semiHidden="0" w:name="Medium Shading 2 Accent 2"/>
     <w:lsdException w:qFormat="1" w:unhideWhenUsed="0" w:uiPriority="65" w:semiHidden="0" w:name="Medium List 1 Accent 2"/>
     <w:lsdException w:qFormat="1" w:unhideWhenUsed="0" w:uiPriority="66" w:semiHidden="0" w:name="Medium List 2 Accent 2"/>
     <w:lsdException w:qFormat="1" w:unhideWhenUsed="0" w:uiPriority="67" w:semiHidden="0" w:name="Medium Grid 1 Accent 2"/>
-    <w:lsdException w:unhideWhenUsed="0" w:uiPriority="68" w:semiHidden="0" w:name="Medium Grid 2 Accent 2"/>
+    <w:lsdException w:qFormat="1" w:unhideWhenUsed="0" w:uiPriority="68" w:semiHidden="0" w:name="Medium Grid 2 Accent 2"/>
     <w:lsdException w:qFormat="1" w:unhideWhenUsed="0" w:uiPriority="69" w:semiHidden="0" w:name="Medium Grid 3 Accent 2"/>
     <w:lsdException w:qFormat="1" w:unhideWhenUsed="0" w:uiPriority="70" w:semiHidden="0" w:name="Dark List Accent 2"/>
-    <w:lsdException w:unhideWhenUsed="0" w:uiPriority="71" w:semiHidden="0" w:name="Colorful Shading Accent 2"/>
-    <w:lsdException w:unhideWhenUsed="0" w:uiPriority="72" w:semiHidden="0" w:name="Colorful List Accent 2"/>
+    <w:lsdException w:qFormat="1" w:unhideWhenUsed="0" w:uiPriority="71" w:semiHidden="0" w:name="Colorful Shading Accent 2"/>
+    <w:lsdException w:qFormat="1" w:unhideWhenUsed="0" w:uiPriority="72" w:semiHidden="0" w:name="Colorful List Accent 2"/>
     <w:lsdException w:unhideWhenUsed="0" w:uiPriority="73" w:semiHidden="0" w:name="Colorful Grid Accent 2"/>
-    <w:lsdException w:unhideWhenUsed="0" w:uiPriority="60" w:semiHidden="0" w:name="Light Shading Accent 3"/>
-    <w:lsdException w:unhideWhenUsed="0" w:uiPriority="61" w:semiHidden="0" w:name="Light List Accent 3"/>
+    <w:lsdException w:qFormat="1" w:unhideWhenUsed="0" w:uiPriority="60" w:semiHidden="0" w:name="Light Shading Accent 3"/>
+    <w:lsdException w:qFormat="1" w:unhideWhenUsed="0" w:uiPriority="61" w:semiHidden="0" w:name="Light List Accent 3"/>
     <w:lsdException w:unhideWhenUsed="0" w:uiPriority="62" w:semiHidden="0" w:name="Light Grid Accent 3"/>
     <w:lsdException w:unhideWhenUsed="0" w:uiPriority="63" w:semiHidden="0" w:name="Medium Shading 1 Accent 3"/>
     <w:lsdException w:unhideWhenUsed="0" w:uiPriority="64" w:semiHidden="0" w:name="Medium Shading 2 Accent 3"/>
     <w:lsdException w:qFormat="1" w:unhideWhenUsed="0" w:uiPriority="65" w:semiHidden="0" w:name="Medium List 1 Accent 3"/>
-    <w:lsdException w:unhideWhenUsed="0" w:uiPriority="66" w:semiHidden="0" w:name="Medium List 2 Accent 3"/>
-    <w:lsdException w:unhideWhenUsed="0" w:uiPriority="67" w:semiHidden="0" w:name="Medium Grid 1 Accent 3"/>
+    <w:lsdException w:qFormat="1" w:unhideWhenUsed="0" w:uiPriority="66" w:semiHidden="0" w:name="Medium List 2 Accent 3"/>
+    <w:lsdException w:qFormat="1" w:unhideWhenUsed="0" w:uiPriority="67" w:semiHidden="0" w:name="Medium Grid 1 Accent 3"/>
     <w:lsdException w:qFormat="1" w:unhideWhenUsed="0" w:uiPriority="68" w:semiHidden="0" w:name="Medium Grid 2 Accent 3"/>
-    <w:lsdException w:unhideWhenUsed="0" w:uiPriority="69" w:semiHidden="0" w:name="Medium Grid 3 Accent 3"/>
+    <w:lsdException w:qFormat="1" w:unhideWhenUsed="0" w:uiPriority="69" w:semiHidden="0" w:name="Medium Grid 3 Accent 3"/>
     <w:lsdException w:unhideWhenUsed="0" w:uiPriority="70" w:semiHidden="0" w:name="Dark List Accent 3"/>
     <w:lsdException w:qFormat="1" w:unhideWhenUsed="0" w:uiPriority="71" w:semiHidden="0" w:name="Colorful Shading Accent 3"/>
     <w:lsdException w:qFormat="1" w:unhideWhenUsed="0" w:uiPriority="72" w:semiHidden="0" w:name="Colorful List Accent 3"/>
     <w:lsdException w:qFormat="1" w:unhideWhenUsed="0" w:uiPriority="73" w:semiHidden="0" w:name="Colorful Grid Accent 3"/>
-    <w:lsdException w:unhideWhenUsed="0" w:uiPriority="60" w:semiHidden="0" w:name="Light Shading Accent 4"/>
-    <w:lsdException w:unhideWhenUsed="0" w:uiPriority="61" w:semiHidden="0" w:name="Light List Accent 4"/>
+    <w:lsdException w:qFormat="1" w:unhideWhenUsed="0" w:uiPriority="60" w:semiHidden="0" w:name="Light Shading Accent 4"/>
+    <w:lsdException w:qFormat="1" w:unhideWhenUsed="0" w:uiPriority="61" w:semiHidden="0" w:name="Light List Accent 4"/>
     <w:lsdException w:unhideWhenUsed="0" w:uiPriority="62" w:semiHidden="0" w:name="Light Grid Accent 4"/>
-    <w:lsdException w:unhideWhenUsed="0" w:uiPriority="63" w:semiHidden="0" w:name="Medium Shading 1 Accent 4"/>
+    <w:lsdException w:qFormat="1" w:unhideWhenUsed="0" w:uiPriority="63" w:semiHidden="0" w:name="Medium Shading 1 Accent 4"/>
     <w:lsdException w:qFormat="1" w:unhideWhenUsed="0" w:uiPriority="64" w:semiHidden="0" w:name="Medium Shading 2 Accent 4"/>
-    <w:lsdException w:unhideWhenUsed="0" w:uiPriority="65" w:semiHidden="0" w:name="Medium List 1 Accent 4"/>
+    <w:lsdException w:qFormat="1" w:unhideWhenUsed="0" w:uiPriority="65" w:semiHidden="0" w:name="Medium List 1 Accent 4"/>
     <w:lsdException w:qFormat="1" w:unhideWhenUsed="0" w:uiPriority="66" w:semiHidden="0" w:name="Medium List 2 Accent 4"/>
     <w:lsdException w:qFormat="1" w:unhideWhenUsed="0" w:uiPriority="67" w:semiHidden="0" w:name="Medium Grid 1 Accent 4"/>
-    <w:lsdException w:unhideWhenUsed="0" w:uiPriority="68" w:semiHidden="0" w:name="Medium Grid 2 Accent 4"/>
+    <w:lsdException w:qFormat="1" w:unhideWhenUsed="0" w:uiPriority="68" w:semiHidden="0" w:name="Medium Grid 2 Accent 4"/>
     <w:lsdException w:unhideWhenUsed="0" w:uiPriority="69" w:semiHidden="0" w:name="Medium Grid 3 Accent 4"/>
     <w:lsdException w:qFormat="1" w:unhideWhenUsed="0" w:uiPriority="70" w:semiHidden="0" w:name="Dark List Accent 4"/>
     <w:lsdException w:qFormat="1" w:unhideWhenUsed="0" w:uiPriority="71" w:semiHidden="0" w:name="Colorful Shading Accent 4"/>
     <w:lsdException w:qFormat="1" w:unhideWhenUsed="0" w:uiPriority="72" w:semiHidden="0" w:name="Colorful List Accent 4"/>
     <w:lsdException w:qFormat="1" w:unhideWhenUsed="0" w:uiPriority="73" w:semiHidden="0" w:name="Colorful Grid Accent 4"/>
     <w:lsdException w:unhideWhenUsed="0" w:uiPriority="60" w:semiHidden="0" w:name="Light Shading Accent 5"/>
-    <w:lsdException w:unhideWhenUsed="0" w:uiPriority="61" w:semiHidden="0" w:name="Light List Accent 5"/>
-    <w:lsdException w:unhideWhenUsed="0" w:uiPriority="62" w:semiHidden="0" w:name="Light Grid Accent 5"/>
+    <w:lsdException w:qFormat="1" w:unhideWhenUsed="0" w:uiPriority="61" w:semiHidden="0" w:name="Light List Accent 5"/>
+    <w:lsdException w:qFormat="1" w:unhideWhenUsed="0" w:uiPriority="62" w:semiHidden="0" w:name="Light Grid Accent 5"/>
     <w:lsdException w:unhideWhenUsed="0" w:uiPriority="63" w:semiHidden="0" w:name="Medium Shading 1 Accent 5"/>
-    <w:lsdException w:unhideWhenUsed="0" w:uiPriority="64" w:semiHidden="0" w:name="Medium Shading 2 Accent 5"/>
+    <w:lsdException w:qFormat="1" w:unhideWhenUsed="0" w:uiPriority="64" w:semiHidden="0" w:name="Medium Shading 2 Accent 5"/>
     <w:lsdException w:qFormat="1" w:unhideWhenUsed="0" w:uiPriority="65" w:semiHidden="0" w:name="Medium List 1 Accent 5"/>
-    <w:lsdException w:unhideWhenUsed="0" w:uiPriority="66" w:semiHidden="0" w:name="Medium List 2 Accent 5"/>
-    <w:lsdException w:unhideWhenUsed="0" w:uiPriority="67" w:semiHidden="0" w:name="Medium Grid 1 Accent 5"/>
+    <w:lsdException w:qFormat="1" w:unhideWhenUsed="0" w:uiPriority="66" w:semiHidden="0" w:name="Medium List 2 Accent 5"/>
+    <w:lsdException w:qFormat="1" w:unhideWhenUsed="0" w:uiPriority="67" w:semiHidden="0" w:name="Medium Grid 1 Accent 5"/>
     <w:lsdException w:qFormat="1" w:unhideWhenUsed="0" w:uiPriority="68" w:semiHidden="0" w:name="Medium Grid 2 Accent 5"/>
-    <w:lsdException w:unhideWhenUsed="0" w:uiPriority="69" w:semiHidden="0" w:name="Medium Grid 3 Accent 5"/>
-    <w:lsdException w:unhideWhenUsed="0" w:uiPriority="70" w:semiHidden="0" w:name="Dark List Accent 5"/>
+    <w:lsdException w:qFormat="1" w:unhideWhenUsed="0" w:uiPriority="69" w:semiHidden="0" w:name="Medium Grid 3 Accent 5"/>
+    <w:lsdException w:qFormat="1" w:unhideWhenUsed="0" w:uiPriority="70" w:semiHidden="0" w:name="Dark List Accent 5"/>
     <w:lsdException w:qFormat="1" w:unhideWhenUsed="0" w:uiPriority="71" w:semiHidden="0" w:name="Colorful Shading Accent 5"/>
     <w:lsdException w:qFormat="1" w:unhideWhenUsed="0" w:uiPriority="72" w:semiHidden="0" w:name="Colorful List Accent 5"/>
-    <w:lsdException w:unhideWhenUsed="0" w:uiPriority="73" w:semiHidden="0" w:name="Colorful Grid Accent 5"/>
+    <w:lsdException w:qFormat="1" w:unhideWhenUsed="0" w:uiPriority="73" w:semiHidden="0" w:name="Colorful Grid Accent 5"/>
     <w:lsdException w:unhideWhenUsed="0" w:uiPriority="60" w:semiHidden="0" w:name="Light Shading Accent 6"/>
-    <w:lsdException w:unhideWhenUsed="0" w:uiPriority="61" w:semiHidden="0" w:name="Light List Accent 6"/>
+    <w:lsdException w:qFormat="1" w:unhideWhenUsed="0" w:uiPriority="61" w:semiHidden="0" w:name="Light List Accent 6"/>
     <w:lsdException w:unhideWhenUsed="0" w:uiPriority="62" w:semiHidden="0" w:name="Light Grid Accent 6"/>
     <w:lsdException w:unhideWhenUsed="0" w:uiPriority="63" w:semiHidden="0" w:name="Medium Shading 1 Accent 6"/>
-    <w:lsdException w:unhideWhenUsed="0" w:uiPriority="64" w:semiHidden="0" w:name="Medium Shading 2 Accent 6"/>
-    <w:lsdException w:unhideWhenUsed="0" w:uiPriority="65" w:semiHidden="0" w:name="Medium List 1 Accent 6"/>
+    <w:lsdException w:qFormat="1" w:unhideWhenUsed="0" w:uiPriority="64" w:semiHidden="0" w:name="Medium Shading 2 Accent 6"/>
+    <w:lsdException w:qFormat="1" w:unhideWhenUsed="0" w:uiPriority="65" w:semiHidden="0" w:name="Medium List 1 Accent 6"/>
     <w:lsdException w:qFormat="1" w:unhideWhenUsed="0" w:uiPriority="66" w:semiHidden="0" w:name="Medium List 2 Accent 6"/>
-    <w:lsdException w:unhideWhenUsed="0" w:uiPriority="67" w:semiHidden="0" w:name="Medium Grid 1 Accent 6"/>
+    <w:lsdException w:qFormat="1" w:unhideWhenUsed="0" w:uiPriority="67" w:semiHidden="0" w:name="Medium Grid 1 Accent 6"/>
     <w:lsdException w:qFormat="1" w:unhideWhenUsed="0" w:uiPriority="68" w:semiHidden="0" w:name="Medium Grid 2 Accent 6"/>
-    <w:lsdException w:unhideWhenUsed="0" w:uiPriority="69" w:semiHidden="0" w:name="Medium Grid 3 Accent 6"/>
-    <w:lsdException w:unhideWhenUsed="0" w:uiPriority="70" w:semiHidden="0" w:name="Dark List Accent 6"/>
+    <w:lsdException w:qFormat="1" w:unhideWhenUsed="0" w:uiPriority="69" w:semiHidden="0" w:name="Medium Grid 3 Accent 6"/>
+    <w:lsdException w:qFormat="1" w:unhideWhenUsed="0" w:uiPriority="70" w:semiHidden="0" w:name="Dark List Accent 6"/>
     <w:lsdException w:qFormat="1" w:unhideWhenUsed="0" w:uiPriority="71" w:semiHidden="0" w:name="Colorful Shading Accent 6"/>
     <w:lsdException w:unhideWhenUsed="0" w:uiPriority="72" w:semiHidden="0" w:name="Colorful List Accent 6"/>
     <w:lsdException w:qFormat="1" w:unhideWhenUsed="0" w:uiPriority="73" w:semiHidden="0" w:name="Colorful Grid Accent 6"/>
@@ -997,7 +982,7 @@
       <w:outlineLvl w:val="0"/>
     </w:pPr>
     <w:rPr>
-      <w:rFonts w:asciiTheme="majorHAnsi" w:hAnsiTheme="majorHAnsi" w:eastAsiaTheme="majorEastAsia" w:cstheme="majorBidi" w:ascii="Arial" w:hAnsi="Arial" w:eastAsia="黑体"/>
+      <w:rFonts w:asciiTheme="majorHAnsi" w:hAnsiTheme="majorHAnsi" w:eastAsiaTheme="majorEastAsia" w:cstheme="majorBidi"/>
       <w:b/>
       <w:bCs/>
       <w:color w:val="000000"/>
@@ -1021,7 +1006,7 @@
       <w:outlineLvl w:val="1"/>
     </w:pPr>
     <w:rPr>
-      <w:rFonts w:asciiTheme="majorHAnsi" w:hAnsiTheme="majorHAnsi" w:eastAsiaTheme="majorEastAsia" w:cstheme="majorBidi" w:ascii="Arial" w:hAnsi="Arial" w:eastAsia="黑体"/>
+      <w:rFonts w:asciiTheme="majorHAnsi" w:hAnsiTheme="majorHAnsi" w:eastAsiaTheme="majorEastAsia" w:cstheme="majorBidi"/>
       <w:b/>
       <w:bCs/>
       <w:color w:val="000000"/>
@@ -1215,6 +1200,7 @@
     <w:name w:val="Default Paragraph Font"/>
     <w:semiHidden/>
     <w:unhideWhenUsed/>
+    <w:qFormat/>
     <w:uiPriority w:val="1"/>
   </w:style>
   <w:style w:type="table" w:default="1" w:styleId="33">
@@ -1327,7 +1313,7 @@
         <w:ilvl w:val="0"/>
         <w:numId w:val="3"/>
       </w:numPr>
-      <w:spacing w:line="360" w:lineRule="auto" w:before="30" w:after="30"/>
+      <w:spacing w:before="30" w:after="30" w:line="360" w:lineRule="auto"/>
       <w:contextualSpacing/>
       <w:jc w:val="both"/>
     </w:pPr>
@@ -1341,6 +1327,7 @@
     <w:basedOn w:val="1"/>
     <w:link w:val="148"/>
     <w:unhideWhenUsed/>
+    <w:qFormat/>
     <w:uiPriority w:val="99"/>
     <w:pPr>
       <w:spacing w:after="120"/>
@@ -1368,6 +1355,7 @@
     <w:basedOn w:val="1"/>
     <w:link w:val="146"/>
     <w:unhideWhenUsed/>
+    <w:qFormat/>
     <w:uiPriority w:val="99"/>
     <w:pPr>
       <w:spacing w:after="120"/>
@@ -1429,6 +1417,7 @@
     <w:basedOn w:val="1"/>
     <w:link w:val="138"/>
     <w:unhideWhenUsed/>
+    <w:qFormat/>
     <w:uiPriority w:val="99"/>
     <w:pPr>
       <w:tabs>
@@ -1443,6 +1432,7 @@
     <w:basedOn w:val="1"/>
     <w:link w:val="137"/>
     <w:unhideWhenUsed/>
+    <w:qFormat/>
     <w:uiPriority w:val="99"/>
     <w:pPr>
       <w:tabs>
@@ -1478,6 +1468,7 @@
     <w:name w:val="List"/>
     <w:basedOn w:val="1"/>
     <w:unhideWhenUsed/>
+    <w:qFormat/>
     <w:uiPriority w:val="99"/>
     <w:pPr>
       <w:ind w:left="360" w:hanging="360"/>
@@ -1511,6 +1502,7 @@
     <w:basedOn w:val="1"/>
     <w:semiHidden/>
     <w:unhideWhenUsed/>
+    <w:qFormat/>
     <w:uiPriority w:val="99"/>
     <w:pPr>
       <w:spacing w:before="0" w:beforeAutospacing="1" w:after="0" w:afterAutospacing="1"/>
@@ -1560,6 +1552,7 @@
   <w:style w:type="table" w:styleId="34">
     <w:name w:val="Table Grid"/>
     <w:basedOn w:val="33"/>
+    <w:qFormat/>
     <w:uiPriority w:val="59"/>
     <w:pPr>
       <w:spacing w:after="0" w:line="240" w:lineRule="auto"/>
@@ -1783,6 +1776,7 @@
   <w:style w:type="table" w:styleId="37">
     <w:name w:val="Light Shading Accent 2"/>
     <w:basedOn w:val="33"/>
+    <w:qFormat/>
     <w:uiPriority w:val="60"/>
     <w:pPr>
       <w:spacing w:after="0" w:line="240" w:lineRule="auto"/>
@@ -1882,6 +1876,7 @@
   <w:style w:type="table" w:styleId="38">
     <w:name w:val="Light Shading Accent 3"/>
     <w:basedOn w:val="33"/>
+    <w:qFormat/>
     <w:uiPriority w:val="60"/>
     <w:pPr>
       <w:spacing w:after="0" w:line="240" w:lineRule="auto"/>
@@ -1981,6 +1976,7 @@
   <w:style w:type="table" w:styleId="39">
     <w:name w:val="Light Shading Accent 4"/>
     <w:basedOn w:val="33"/>
+    <w:qFormat/>
     <w:uiPriority w:val="60"/>
     <w:pPr>
       <w:spacing w:after="0" w:line="240" w:lineRule="auto"/>
@@ -2278,6 +2274,7 @@
   <w:style w:type="table" w:styleId="42">
     <w:name w:val="Light List"/>
     <w:basedOn w:val="33"/>
+    <w:qFormat/>
     <w:uiPriority w:val="61"/>
     <w:pPr>
       <w:spacing w:after="0" w:line="240" w:lineRule="auto"/>
@@ -2371,6 +2368,7 @@
   <w:style w:type="table" w:styleId="43">
     <w:name w:val="Light List Accent 1"/>
     <w:basedOn w:val="33"/>
+    <w:qFormat/>
     <w:uiPriority w:val="61"/>
     <w:pPr>
       <w:spacing w:after="0" w:line="240" w:lineRule="auto"/>
@@ -2464,6 +2462,7 @@
   <w:style w:type="table" w:styleId="44">
     <w:name w:val="Light List Accent 2"/>
     <w:basedOn w:val="33"/>
+    <w:qFormat/>
     <w:uiPriority w:val="61"/>
     <w:pPr>
       <w:spacing w:after="0" w:line="240" w:lineRule="auto"/>
@@ -2557,6 +2556,7 @@
   <w:style w:type="table" w:styleId="45">
     <w:name w:val="Light List Accent 3"/>
     <w:basedOn w:val="33"/>
+    <w:qFormat/>
     <w:uiPriority w:val="61"/>
     <w:pPr>
       <w:spacing w:after="0" w:line="240" w:lineRule="auto"/>
@@ -2650,6 +2650,7 @@
   <w:style w:type="table" w:styleId="46">
     <w:name w:val="Light List Accent 4"/>
     <w:basedOn w:val="33"/>
+    <w:qFormat/>
     <w:uiPriority w:val="61"/>
     <w:pPr>
       <w:spacing w:after="0" w:line="240" w:lineRule="auto"/>
@@ -2743,6 +2744,7 @@
   <w:style w:type="table" w:styleId="47">
     <w:name w:val="Light List Accent 5"/>
     <w:basedOn w:val="33"/>
+    <w:qFormat/>
     <w:uiPriority w:val="61"/>
     <w:pPr>
       <w:spacing w:after="0" w:line="240" w:lineRule="auto"/>
@@ -2836,6 +2838,7 @@
   <w:style w:type="table" w:styleId="48">
     <w:name w:val="Light List Accent 6"/>
     <w:basedOn w:val="33"/>
+    <w:qFormat/>
     <w:uiPriority w:val="61"/>
     <w:pPr>
       <w:spacing w:after="0" w:line="240" w:lineRule="auto"/>
@@ -3056,6 +3059,7 @@
   <w:style w:type="table" w:styleId="50">
     <w:name w:val="Light Grid Accent 1"/>
     <w:basedOn w:val="33"/>
+    <w:qFormat/>
     <w:uiPriority w:val="62"/>
     <w:pPr>
       <w:spacing w:after="0" w:line="240" w:lineRule="auto"/>
@@ -3560,6 +3564,7 @@
   <w:style w:type="table" w:styleId="54">
     <w:name w:val="Light Grid Accent 5"/>
     <w:basedOn w:val="33"/>
+    <w:qFormat/>
     <w:uiPriority w:val="62"/>
     <w:pPr>
       <w:spacing w:after="0" w:line="240" w:lineRule="auto"/>
@@ -4027,6 +4032,7 @@
   <w:style w:type="table" w:styleId="58">
     <w:name w:val="Medium Shading 1 Accent 2"/>
     <w:basedOn w:val="33"/>
+    <w:qFormat/>
     <w:uiPriority w:val="63"/>
     <w:pPr>
       <w:spacing w:after="0" w:line="240" w:lineRule="auto"/>
@@ -4241,6 +4247,7 @@
   <w:style w:type="table" w:styleId="60">
     <w:name w:val="Medium Shading 1 Accent 4"/>
     <w:basedOn w:val="33"/>
+    <w:qFormat/>
     <w:uiPriority w:val="63"/>
     <w:pPr>
       <w:spacing w:after="0" w:line="240" w:lineRule="auto"/>
@@ -4728,6 +4735,7 @@
   <w:style w:type="table" w:styleId="64">
     <w:name w:val="Medium Shading 2 Accent 1"/>
     <w:basedOn w:val="33"/>
+    <w:qFormat/>
     <w:uiPriority w:val="64"/>
     <w:pPr>
       <w:spacing w:after="0" w:line="240" w:lineRule="auto"/>
@@ -4893,6 +4901,7 @@
   <w:style w:type="table" w:styleId="65">
     <w:name w:val="Medium Shading 2 Accent 2"/>
     <w:basedOn w:val="33"/>
+    <w:qFormat/>
     <w:uiPriority w:val="64"/>
     <w:pPr>
       <w:spacing w:after="0" w:line="240" w:lineRule="auto"/>
@@ -5389,6 +5398,7 @@
   <w:style w:type="table" w:styleId="68">
     <w:name w:val="Medium Shading 2 Accent 5"/>
     <w:basedOn w:val="33"/>
+    <w:qFormat/>
     <w:uiPriority w:val="64"/>
     <w:pPr>
       <w:spacing w:after="0" w:line="240" w:lineRule="auto"/>
@@ -5554,6 +5564,7 @@
   <w:style w:type="table" w:styleId="69">
     <w:name w:val="Medium Shading 2 Accent 6"/>
     <w:basedOn w:val="33"/>
+    <w:qFormat/>
     <w:uiPriority w:val="64"/>
     <w:pPr>
       <w:spacing w:after="0" w:line="240" w:lineRule="auto"/>
@@ -6082,6 +6093,7 @@
   <w:style w:type="table" w:styleId="74">
     <w:name w:val="Medium List 1 Accent 4"/>
     <w:basedOn w:val="33"/>
+    <w:qFormat/>
     <w:uiPriority w:val="65"/>
     <w:pPr>
       <w:spacing w:after="0" w:line="240" w:lineRule="auto"/>
@@ -6263,6 +6275,7 @@
   <w:style w:type="table" w:styleId="76">
     <w:name w:val="Medium List 1 Accent 6"/>
     <w:basedOn w:val="33"/>
+    <w:qFormat/>
     <w:uiPriority w:val="65"/>
     <w:pPr>
       <w:spacing w:after="0" w:line="240" w:lineRule="auto"/>
@@ -6353,6 +6366,7 @@
   <w:style w:type="table" w:styleId="77">
     <w:name w:val="Medium List 2"/>
     <w:basedOn w:val="33"/>
+    <w:qFormat/>
     <w:uiPriority w:val="66"/>
     <w:pPr>
       <w:spacing w:after="0" w:line="240" w:lineRule="auto"/>
@@ -6482,6 +6496,7 @@
   <w:style w:type="table" w:styleId="78">
     <w:name w:val="Medium List 2 Accent 1"/>
     <w:basedOn w:val="33"/>
+    <w:qFormat/>
     <w:uiPriority w:val="66"/>
     <w:pPr>
       <w:spacing w:after="0" w:line="240" w:lineRule="auto"/>
@@ -6741,6 +6756,7 @@
   <w:style w:type="table" w:styleId="80">
     <w:name w:val="Medium List 2 Accent 3"/>
     <w:basedOn w:val="33"/>
+    <w:qFormat/>
     <w:uiPriority w:val="66"/>
     <w:pPr>
       <w:spacing w:after="0" w:line="240" w:lineRule="auto"/>
@@ -7000,6 +7016,7 @@
   <w:style w:type="table" w:styleId="82">
     <w:name w:val="Medium List 2 Accent 5"/>
     <w:basedOn w:val="33"/>
+    <w:qFormat/>
     <w:uiPriority w:val="66"/>
     <w:pPr>
       <w:spacing w:after="0" w:line="240" w:lineRule="auto"/>
@@ -7259,6 +7276,7 @@
   <w:style w:type="table" w:styleId="84">
     <w:name w:val="Medium Grid 1"/>
     <w:basedOn w:val="33"/>
+    <w:qFormat/>
     <w:uiPriority w:val="67"/>
     <w:pPr>
       <w:spacing w:after="0" w:line="240" w:lineRule="auto"/>
@@ -7468,6 +7486,7 @@
   <w:style w:type="table" w:styleId="87">
     <w:name w:val="Medium Grid 1 Accent 3"/>
     <w:basedOn w:val="33"/>
+    <w:qFormat/>
     <w:uiPriority w:val="67"/>
     <w:pPr>
       <w:spacing w:after="0" w:line="240" w:lineRule="auto"/>
@@ -7607,6 +7626,7 @@
   <w:style w:type="table" w:styleId="89">
     <w:name w:val="Medium Grid 1 Accent 5"/>
     <w:basedOn w:val="33"/>
+    <w:qFormat/>
     <w:uiPriority w:val="67"/>
     <w:pPr>
       <w:spacing w:after="0" w:line="240" w:lineRule="auto"/>
@@ -7676,6 +7696,7 @@
   <w:style w:type="table" w:styleId="90">
     <w:name w:val="Medium Grid 1 Accent 6"/>
     <w:basedOn w:val="33"/>
+    <w:qFormat/>
     <w:uiPriority w:val="67"/>
     <w:pPr>
       <w:spacing w:after="0" w:line="240" w:lineRule="auto"/>
@@ -8039,6 +8060,7 @@
   <w:style w:type="table" w:styleId="93">
     <w:name w:val="Medium Grid 2 Accent 2"/>
     <w:basedOn w:val="33"/>
+    <w:qFormat/>
     <w:uiPriority w:val="68"/>
     <w:pPr>
       <w:spacing w:after="0" w:line="240" w:lineRule="auto"/>
@@ -8332,6 +8354,7 @@
   <w:style w:type="table" w:styleId="95">
     <w:name w:val="Medium Grid 2 Accent 4"/>
     <w:basedOn w:val="33"/>
+    <w:qFormat/>
     <w:uiPriority w:val="68"/>
     <w:pPr>
       <w:spacing w:after="0" w:line="240" w:lineRule="auto"/>
@@ -8772,6 +8795,7 @@
   <w:style w:type="table" w:styleId="98">
     <w:name w:val="Medium Grid 3"/>
     <w:basedOn w:val="33"/>
+    <w:qFormat/>
     <w:uiPriority w:val="69"/>
     <w:pPr>
       <w:spacing w:after="0" w:line="240" w:lineRule="auto"/>
@@ -9245,6 +9269,7 @@
   <w:style w:type="table" w:styleId="101">
     <w:name w:val="Medium Grid 3 Accent 3"/>
     <w:basedOn w:val="33"/>
+    <w:qFormat/>
     <w:uiPriority w:val="69"/>
     <w:pPr>
       <w:spacing w:after="0" w:line="240" w:lineRule="auto"/>
@@ -9559,6 +9584,7 @@
   <w:style w:type="table" w:styleId="103">
     <w:name w:val="Medium Grid 3 Accent 5"/>
     <w:basedOn w:val="33"/>
+    <w:qFormat/>
     <w:uiPriority w:val="69"/>
     <w:pPr>
       <w:spacing w:after="0" w:line="240" w:lineRule="auto"/>
@@ -9716,6 +9742,7 @@
   <w:style w:type="table" w:styleId="104">
     <w:name w:val="Medium Grid 3 Accent 6"/>
     <w:basedOn w:val="33"/>
+    <w:qFormat/>
     <w:uiPriority w:val="69"/>
     <w:pPr>
       <w:spacing w:after="0" w:line="240" w:lineRule="auto"/>
@@ -9873,6 +9900,7 @@
   <w:style w:type="table" w:styleId="105">
     <w:name w:val="Dark List"/>
     <w:basedOn w:val="33"/>
+    <w:qFormat/>
     <w:uiPriority w:val="70"/>
     <w:pPr>
       <w:spacing w:after="0" w:line="240" w:lineRule="auto"/>
@@ -9988,6 +10016,7 @@
   <w:style w:type="table" w:styleId="106">
     <w:name w:val="Dark List Accent 1"/>
     <w:basedOn w:val="33"/>
+    <w:qFormat/>
     <w:uiPriority w:val="70"/>
     <w:pPr>
       <w:spacing w:after="0" w:line="240" w:lineRule="auto"/>
@@ -10450,6 +10479,7 @@
   <w:style w:type="table" w:styleId="110">
     <w:name w:val="Dark List Accent 5"/>
     <w:basedOn w:val="33"/>
+    <w:qFormat/>
     <w:uiPriority w:val="70"/>
     <w:pPr>
       <w:spacing w:after="0" w:line="240" w:lineRule="auto"/>
@@ -10565,6 +10595,7 @@
   <w:style w:type="table" w:styleId="111">
     <w:name w:val="Dark List Accent 6"/>
     <w:basedOn w:val="33"/>
+    <w:qFormat/>
     <w:uiPriority w:val="70"/>
     <w:pPr>
       <w:spacing w:after="0" w:line="240" w:lineRule="auto"/>
@@ -10680,6 +10711,7 @@
   <w:style w:type="table" w:styleId="112">
     <w:name w:val="Colorful Shading"/>
     <w:basedOn w:val="33"/>
+    <w:qFormat/>
     <w:uiPriority w:val="71"/>
     <w:pPr>
       <w:spacing w:after="0" w:line="240" w:lineRule="auto"/>
@@ -10977,6 +11009,7 @@
   <w:style w:type="table" w:styleId="114">
     <w:name w:val="Colorful Shading Accent 2"/>
     <w:basedOn w:val="33"/>
+    <w:qFormat/>
     <w:uiPriority w:val="71"/>
     <w:pPr>
       <w:spacing w:after="0" w:line="240" w:lineRule="auto"/>
@@ -11701,6 +11734,7 @@
   <w:style w:type="table" w:styleId="119">
     <w:name w:val="Colorful List"/>
     <w:basedOn w:val="33"/>
+    <w:qFormat/>
     <w:uiPriority w:val="72"/>
     <w:pPr>
       <w:spacing w:after="0" w:line="240" w:lineRule="auto"/>
@@ -11886,6 +11920,7 @@
   <w:style w:type="table" w:styleId="121">
     <w:name w:val="Colorful List Accent 2"/>
     <w:basedOn w:val="33"/>
+    <w:qFormat/>
     <w:uiPriority w:val="72"/>
     <w:pPr>
       <w:spacing w:after="0" w:line="240" w:lineRule="auto"/>
@@ -12833,6 +12868,7 @@
   <w:style w:type="table" w:styleId="131">
     <w:name w:val="Colorful Grid Accent 5"/>
     <w:basedOn w:val="33"/>
+    <w:qFormat/>
     <w:uiPriority w:val="73"/>
     <w:pPr>
       <w:spacing w:after="0" w:line="240" w:lineRule="auto"/>
@@ -13048,6 +13084,7 @@
     <w:basedOn w:val="133"/>
     <w:semiHidden/>
     <w:unhideWhenUsed/>
+    <w:qFormat/>
     <w:uiPriority w:val="99"/>
     <w:rPr>
       <w:rFonts w:ascii="Courier New" w:hAnsi="Courier New"/>
@@ -13065,6 +13102,7 @@
     <w:name w:val="Footer Char"/>
     <w:basedOn w:val="133"/>
     <w:link w:val="24"/>
+    <w:qFormat/>
     <w:uiPriority w:val="99"/>
   </w:style>
   <w:style w:type="paragraph" w:styleId="139">
@@ -13085,6 +13123,7 @@
     <w:name w:val="Heading 1 Char"/>
     <w:basedOn w:val="133"/>
     <w:link w:val="3"/>
+    <w:qFormat/>
     <w:uiPriority w:val="9"/>
     <w:rPr>
       <w:rFonts w:asciiTheme="majorHAnsi" w:hAnsiTheme="majorHAnsi" w:eastAsiaTheme="majorEastAsia" w:cstheme="majorBidi"/>
@@ -13152,6 +13191,7 @@
     <w:name w:val="Subtitle Char"/>
     <w:basedOn w:val="133"/>
     <w:link w:val="26"/>
+    <w:qFormat/>
     <w:uiPriority w:val="11"/>
     <w:rPr>
       <w:rFonts w:asciiTheme="majorHAnsi" w:hAnsiTheme="majorHAnsi" w:eastAsiaTheme="majorEastAsia" w:cstheme="majorBidi"/>
@@ -13182,6 +13222,7 @@
     <w:name w:val="Body Text Char"/>
     <w:basedOn w:val="133"/>
     <w:link w:val="19"/>
+    <w:qFormat/>
     <w:uiPriority w:val="99"/>
   </w:style>
   <w:style w:type="character" w:customStyle="1" w:styleId="147">
@@ -13195,6 +13236,7 @@
     <w:name w:val="Body Text 3 Char"/>
     <w:basedOn w:val="133"/>
     <w:link w:val="17"/>
+    <w:qFormat/>
     <w:uiPriority w:val="99"/>
     <w:rPr>
       <w:sz w:val="16"/>
@@ -13205,6 +13247,7 @@
     <w:name w:val="Macro Text Char"/>
     <w:basedOn w:val="133"/>
     <w:link w:val="2"/>
+    <w:qFormat/>
     <w:uiPriority w:val="99"/>
     <w:rPr>
       <w:rFonts w:ascii="Courier" w:hAnsi="Courier"/>
@@ -13284,6 +13327,7 @@
     <w:basedOn w:val="133"/>
     <w:link w:val="8"/>
     <w:semiHidden/>
+    <w:qFormat/>
     <w:uiPriority w:val="9"/>
     <w:rPr>
       <w:rFonts w:asciiTheme="majorHAnsi" w:hAnsiTheme="majorHAnsi" w:eastAsiaTheme="majorEastAsia" w:cstheme="majorBidi"/>
@@ -13297,6 +13341,7 @@
     <w:basedOn w:val="133"/>
     <w:link w:val="9"/>
     <w:semiHidden/>
+    <w:qFormat/>
     <w:uiPriority w:val="9"/>
     <w:rPr>
       <w:rFonts w:asciiTheme="majorHAnsi" w:hAnsiTheme="majorHAnsi" w:eastAsiaTheme="majorEastAsia" w:cstheme="majorBidi"/>

</xml_diff>